<commit_message>
Add SME storyboard review register
Co-authored-by: arena-agent <297053741+arena-agent@users.noreply.github.com>
</commit_message>
<xml_diff>
--- a/elearning-course/scorm-plans/client-review/MyClinic_04_Operations_and_My_Care_Storyboard_v0.2.docx
+++ b/elearning-course/scorm-plans/client-review/MyClinic_04_Operations_and_My_Care_Storyboard_v0.2.docx
@@ -132,7 +132,12 @@
     </w:p>
     <w:p>
       <w:r>
-        <w:t>voice_talent.md · asset-register.md · lint-report.json.</w:t>
+        <w:t>voice_talent.md · asset-register.md · lint-report.json ·</w:t>
+      </w:r>
+    </w:p>
+    <w:p>
+      <w:r>
+        <w:t>programme SME/build-detail register.</w:t>
       </w:r>
     </w:p>
     <w:p>

</xml_diff>